<commit_message>
Document backup verification and health checks
</commit_message>
<xml_diff>
--- a/docs/user-guide/Blessing Tree User Guide.docx
+++ b/docs/user-guide/Blessing Tree User Guide.docx
@@ -74,7 +74,7 @@
         <w:jc w:val="center"/>
       </w:pPr>
       <w:r>
-        <w:t>Prepared May 29, 2026</w:t>
+        <w:t>Prepared June 5, 2026</w:t>
       </w:r>
     </w:p>
     <w:tbl>
@@ -1502,7 +1502,7 @@
         <w:spacing w:after="120" w:line="300" w:lineRule="auto"/>
       </w:pPr>
       <w:r>
-        <w:t>Use the directory when someone is already in the system. Search for a family, organization, child, or adult, then click the row to open the drawer. The drawer is also where staff can add another child or adult to an existing household, add a family under an organization, edit contacts, and manage wishlist details.</w:t>
+        <w:t>Use the directory when someone is already in the system. Search for a family, organization, child, or adult, then click the row to open the drawer. The drawer is also where staff can add another child or adult to an existing household, add a family under an organization, edit contacts, and manage wishlist details. Directory tables include sortable recipient IDs, program abbreviation quick filters, gift descriptions, gift sizes/details, and committed sponsor names. Use Expand All or Collapse All on the left and PDF or Excel export buttons in the upper right when staff need a printed operating list.</w:t>
       </w:r>
     </w:p>
     <w:p>
@@ -1899,7 +1899,112 @@
         <w:spacing w:after="120" w:line="300" w:lineRule="auto"/>
       </w:pPr>
       <w:r>
-        <w:t>Gift Search helps staff or eligible sponsors find gifts to reserve or commit to. The search supports natural-language prompts such as 'girls age 8 to 10 who need coats' and returns matching wishlist items. From there, a user with the right access can commit a sponsor to a gift.</w:t>
+        <w:t>Gift Search helps staff or eligible sponsors find gifts to reserve or commit to. The search supports natural-language prompts such as 'girls age 8 to 10 who need coats' and can use Qdrant semantic matching for broader terms such as toys, Batman gifts, or video games when the wishlist uses a more specific description. Search chips show inferred filters and can be cleared. Results are paginated and can be exported to PDF or Excel from the upper right of the results container.</w:t>
+      </w:r>
+    </w:p>
+    <w:p>
+      <w:pPr>
+        <w:pStyle w:val="Heading3"/>
+      </w:pPr>
+      <w:r>
+        <w:rPr>
+          <w:rFonts w:ascii="Calibri" w:hAnsi="Calibri"/>
+          <w:color w:val="1F4D78"/>
+        </w:rPr>
+        <w:t>Commit a Gift to a Sponsor</w:t>
+      </w:r>
+    </w:p>
+    <w:p>
+      <w:pPr>
+        <w:pStyle w:val="ListNumber"/>
+        <w:spacing w:after="80" w:line="300" w:lineRule="auto"/>
+      </w:pPr>
+      <w:r>
+        <w:t>Open Gift Search or Gift Status.</w:t>
+      </w:r>
+    </w:p>
+    <w:p>
+      <w:pPr>
+        <w:pStyle w:val="ListNumber"/>
+        <w:spacing w:after="80" w:line="300" w:lineRule="auto"/>
+      </w:pPr>
+      <w:r>
+        <w:t>Select the gift and open the commit action.</w:t>
+      </w:r>
+    </w:p>
+    <w:p>
+      <w:pPr>
+        <w:pStyle w:val="ListNumber"/>
+        <w:spacing w:after="80" w:line="300" w:lineRule="auto"/>
+      </w:pPr>
+      <w:r>
+        <w:t>Search for the sponsor by name, email, phone, or organization.</w:t>
+      </w:r>
+    </w:p>
+    <w:p>
+      <w:pPr>
+        <w:pStyle w:val="ListNumber"/>
+        <w:spacing w:after="80" w:line="300" w:lineRule="auto"/>
+      </w:pPr>
+      <w:r>
+        <w:t>Click the sponsor result so the selected sponsor appears below the search bar.</w:t>
+      </w:r>
+    </w:p>
+    <w:p>
+      <w:pPr>
+        <w:pStyle w:val="ListNumber"/>
+        <w:spacing w:after="80" w:line="300" w:lineRule="auto"/>
+      </w:pPr>
+      <w:r>
+        <w:t>Add optional notes for the commitment.</w:t>
+      </w:r>
+    </w:p>
+    <w:p>
+      <w:pPr>
+        <w:pStyle w:val="ListNumber"/>
+        <w:spacing w:after="80" w:line="300" w:lineRule="auto"/>
+      </w:pPr>
+      <w:r>
+        <w:t>Choose Commit.</w:t>
+      </w:r>
+    </w:p>
+    <w:p>
+      <w:pPr>
+        <w:pStyle w:val="Heading3"/>
+      </w:pPr>
+      <w:r>
+        <w:rPr>
+          <w:rFonts w:ascii="Calibri" w:hAnsi="Calibri"/>
+          <w:color w:val="1F4D78"/>
+        </w:rPr>
+        <w:t>Review or Release a Committed Gift</w:t>
+      </w:r>
+    </w:p>
+    <w:p>
+      <w:pPr>
+        <w:pStyle w:val="ListNumber"/>
+        <w:spacing w:after="80" w:line="300" w:lineRule="auto"/>
+      </w:pPr>
+      <w:r>
+        <w:t>Click a recipient in Gift Search to review recipient and gift details.</w:t>
+      </w:r>
+    </w:p>
+    <w:p>
+      <w:pPr>
+        <w:pStyle w:val="ListNumber"/>
+        <w:spacing w:after="80" w:line="300" w:lineRule="auto"/>
+      </w:pPr>
+      <w:r>
+        <w:t>Click a sponsor name on a committed gift to open the sponsor drawer.</w:t>
+      </w:r>
+    </w:p>
+    <w:p>
+      <w:pPr>
+        <w:pStyle w:val="ListNumber"/>
+        <w:spacing w:after="80" w:line="300" w:lineRule="auto"/>
+      </w:pPr>
+      <w:r>
+        <w:t>To make a committed gift available again, choose Release and confirm the sponsor shown in the modal.</w:t>
       </w:r>
     </w:p>
     <w:p>
@@ -3099,7 +3204,7 @@
         <w:spacing w:after="120" w:line="300" w:lineRule="auto"/>
       </w:pPr>
       <w:r>
-        <w:t>Health Check shows database, Celery, and LLM health. App Capabilities lets admins enable or disable major app surfaces such as People, Sponsors, Reports, Donations, and campaign AI.</w:t>
+        <w:t>Health Check shows database, Celery, LLM/embedding, Qdrant, email, and storage health. Use it after deploys, restores, and configuration changes to see which dependency needs attention first. App Capabilities lets admins enable or disable major app surfaces such as People, Sponsors, Reports, Donations, and campaign AI.</w:t>
       </w:r>
     </w:p>
     <w:p>

</xml_diff>

<commit_message>
Refresh safety docs and Ask knowledge
</commit_message>
<xml_diff>
--- a/docs/user-guide/Blessing Tree User Guide.docx
+++ b/docs/user-guide/Blessing Tree User Guide.docx
@@ -3207,6 +3207,390 @@
         <w:t>Health Check shows database, Celery, LLM/embedding, Qdrant, email, and storage health. Use it after deploys, restores, and configuration changes to see which dependency needs attention first. App Capabilities lets admins enable or disable major app surfaces such as People, Sponsors, Reports, Donations, and campaign AI.</w:t>
       </w:r>
     </w:p>
+    <w:tbl>
+      <w:tblPr>
+        <w:tblStyle w:val="TableGrid"/>
+        <w:tblW w:type="auto" w:w="0"/>
+        <w:tblLayout w:type="fixed"/>
+        <w:tblLook w:firstColumn="1" w:firstRow="1" w:lastColumn="0" w:lastRow="0" w:noHBand="0" w:noVBand="1" w:val="04A0"/>
+      </w:tblPr>
+      <w:tblGrid>
+        <w:gridCol w:w="4968"/>
+        <w:gridCol w:w="4968"/>
+      </w:tblGrid>
+      <w:tr>
+        <w:tc>
+          <w:tcPr>
+            <w:tcW w:type="dxa" w:w="2304"/>
+            <w:shd w:fill="EDE6F3"/>
+          </w:tcPr>
+          <w:p>
+            <w:r/>
+            <w:r>
+              <w:rPr>
+                <w:b/>
+              </w:rPr>
+              <w:t>Health Check</w:t>
+            </w:r>
+          </w:p>
+        </w:tc>
+        <w:tc>
+          <w:tcPr>
+            <w:tcW w:type="dxa" w:w="6696"/>
+            <w:shd w:fill="EDE6F3"/>
+          </w:tcPr>
+          <w:p>
+            <w:r/>
+            <w:r>
+              <w:rPr>
+                <w:b/>
+              </w:rPr>
+              <w:t>What to do if it needs attention</w:t>
+            </w:r>
+          </w:p>
+        </w:tc>
+      </w:tr>
+      <w:tr>
+        <w:tc>
+          <w:tcPr>
+            <w:tcW w:type="dxa" w:w="2304"/>
+          </w:tcPr>
+          <w:p>
+            <w:r/>
+            <w:r>
+              <w:rPr>
+                <w:b w:val="0"/>
+              </w:rPr>
+              <w:t>Database</w:t>
+            </w:r>
+          </w:p>
+        </w:tc>
+        <w:tc>
+          <w:tcPr>
+            <w:tcW w:type="dxa" w:w="6696"/>
+          </w:tcPr>
+          <w:p>
+            <w:r/>
+            <w:r>
+              <w:rPr>
+                <w:b w:val="0"/>
+              </w:rPr>
+              <w:t>Check RDS status, security groups, database credentials, and DB_HOST.</w:t>
+            </w:r>
+          </w:p>
+        </w:tc>
+      </w:tr>
+      <w:tr>
+        <w:tc>
+          <w:tcPr>
+            <w:tcW w:type="dxa" w:w="2304"/>
+          </w:tcPr>
+          <w:p>
+            <w:r/>
+            <w:r>
+              <w:rPr>
+                <w:b w:val="0"/>
+              </w:rPr>
+              <w:t>Celery</w:t>
+            </w:r>
+          </w:p>
+        </w:tc>
+        <w:tc>
+          <w:tcPr>
+            <w:tcW w:type="dxa" w:w="6696"/>
+          </w:tcPr>
+          <w:p>
+            <w:r/>
+            <w:r>
+              <w:rPr>
+                <w:b w:val="0"/>
+              </w:rPr>
+              <w:t>Check Valkey, celery-worker, celery-beat, and worker logs for the bt queue.</w:t>
+            </w:r>
+          </w:p>
+        </w:tc>
+      </w:tr>
+      <w:tr>
+        <w:tc>
+          <w:tcPr>
+            <w:tcW w:type="dxa" w:w="2304"/>
+          </w:tcPr>
+          <w:p>
+            <w:r/>
+            <w:r>
+              <w:rPr>
+                <w:b w:val="0"/>
+              </w:rPr>
+              <w:t>LLM/Embedding</w:t>
+            </w:r>
+          </w:p>
+        </w:tc>
+        <w:tc>
+          <w:tcPr>
+            <w:tcW w:type="dxa" w:w="6696"/>
+          </w:tcPr>
+          <w:p>
+            <w:r/>
+            <w:r>
+              <w:rPr>
+                <w:b w:val="0"/>
+              </w:rPr>
+              <w:t>Verify the OpenAI key, model allowlist, project permissions, and budget.</w:t>
+            </w:r>
+          </w:p>
+        </w:tc>
+      </w:tr>
+      <w:tr>
+        <w:tc>
+          <w:tcPr>
+            <w:tcW w:type="dxa" w:w="2304"/>
+          </w:tcPr>
+          <w:p>
+            <w:r/>
+            <w:r>
+              <w:rPr>
+                <w:b w:val="0"/>
+              </w:rPr>
+              <w:t>Qdrant</w:t>
+            </w:r>
+          </w:p>
+        </w:tc>
+        <w:tc>
+          <w:tcPr>
+            <w:tcW w:type="dxa" w:w="6696"/>
+          </w:tcPr>
+          <w:p>
+            <w:r/>
+            <w:r>
+              <w:rPr>
+                <w:b w:val="0"/>
+              </w:rPr>
+              <w:t>Check the Qdrant container and QDRANT_URL. Use Generate Index if collections are missing or stale.</w:t>
+            </w:r>
+          </w:p>
+        </w:tc>
+      </w:tr>
+      <w:tr>
+        <w:tc>
+          <w:tcPr>
+            <w:tcW w:type="dxa" w:w="2304"/>
+          </w:tcPr>
+          <w:p>
+            <w:r/>
+            <w:r>
+              <w:rPr>
+                <w:b w:val="0"/>
+              </w:rPr>
+              <w:t>Email</w:t>
+            </w:r>
+          </w:p>
+        </w:tc>
+        <w:tc>
+          <w:tcPr>
+            <w:tcW w:type="dxa" w:w="6696"/>
+          </w:tcPr>
+          <w:p>
+            <w:r/>
+            <w:r>
+              <w:rPr>
+                <w:b w:val="0"/>
+              </w:rPr>
+              <w:t>Confirm SMTP settings, then send a Campaign Studio test email to verify delivery.</w:t>
+            </w:r>
+          </w:p>
+        </w:tc>
+      </w:tr>
+      <w:tr>
+        <w:tc>
+          <w:tcPr>
+            <w:tcW w:type="dxa" w:w="2304"/>
+          </w:tcPr>
+          <w:p>
+            <w:r/>
+            <w:r>
+              <w:rPr>
+                <w:b w:val="0"/>
+              </w:rPr>
+              <w:t>Storage</w:t>
+            </w:r>
+          </w:p>
+        </w:tc>
+        <w:tc>
+          <w:tcPr>
+            <w:tcW w:type="dxa" w:w="6696"/>
+          </w:tcPr>
+          <w:p>
+            <w:r/>
+            <w:r>
+              <w:rPr>
+                <w:b w:val="0"/>
+              </w:rPr>
+              <w:t>Clean old logs/artifacts or increase disk size when free space is low.</w:t>
+            </w:r>
+          </w:p>
+        </w:tc>
+      </w:tr>
+    </w:tbl>
+    <w:p/>
+    <w:tbl>
+      <w:tblPr>
+        <w:tblW w:type="auto" w:w="0"/>
+        <w:tblLayout w:type="fixed"/>
+        <w:tblLook w:firstColumn="1" w:firstRow="1" w:lastColumn="0" w:lastRow="0" w:noHBand="0" w:noVBand="1" w:val="04A0"/>
+      </w:tblPr>
+      <w:tblGrid>
+        <w:gridCol w:w="9936"/>
+      </w:tblGrid>
+      <w:tr>
+        <w:tc>
+          <w:tcPr>
+            <w:tcW w:type="dxa" w:w="9000"/>
+            <w:shd w:fill="F8F5EF"/>
+          </w:tcPr>
+          <w:p>
+            <w:pPr>
+              <w:spacing w:after="60"/>
+            </w:pPr>
+            <w:r>
+              <w:rPr>
+                <w:b/>
+                <w:color w:val="2A0F3D"/>
+              </w:rPr>
+              <w:t>Health checks are non-destructive</w:t>
+            </w:r>
+          </w:p>
+          <w:p>
+            <w:pPr>
+              <w:spacing w:after="0"/>
+            </w:pPr>
+            <w:r>
+              <w:t>The email check verifies configuration only; it does not send mail. The Qdrant Generate Index action rebuilds Ask knowledge and semantic gift search indexes from MySQL.</w:t>
+            </w:r>
+          </w:p>
+        </w:tc>
+      </w:tr>
+    </w:tbl>
+    <w:p>
+      <w:pPr>
+        <w:pStyle w:val="Heading2"/>
+      </w:pPr>
+      <w:r>
+        <w:rPr>
+          <w:rFonts w:ascii="Calibri" w:hAnsi="Calibri"/>
+          <w:color w:val="2A0F3D"/>
+        </w:rPr>
+        <w:t>Production Backup, Restore, and Safety</w:t>
+      </w:r>
+    </w:p>
+    <w:p>
+      <w:pPr>
+        <w:spacing w:after="120" w:line="300" w:lineRule="auto"/>
+      </w:pPr>
+      <w:r>
+        <w:t>Production data lives in RDS MySQL. Qdrant is a rebuildable search index, and Valkey holds operational queue/cache state. Keep RDS automated backups enabled and use manual backups before risky work.</w:t>
+      </w:r>
+    </w:p>
+    <w:p>
+      <w:pPr>
+        <w:pStyle w:val="ListBullet"/>
+        <w:spacing w:after="80" w:line="300" w:lineRule="auto"/>
+      </w:pPr>
+      <w:r>
+        <w:t>Use at least 7 days of RDS backup retention during normal operation.</w:t>
+      </w:r>
+    </w:p>
+    <w:p>
+      <w:pPr>
+        <w:pStyle w:val="ListBullet"/>
+        <w:spacing w:after="80" w:line="300" w:lineRule="auto"/>
+      </w:pPr>
+      <w:r>
+        <w:t>Use at least 14 days of retention during active campaign intake and distribution.</w:t>
+      </w:r>
+    </w:p>
+    <w:p>
+      <w:pPr>
+        <w:pStyle w:val="ListBullet"/>
+        <w:spacing w:after="80" w:line="300" w:lineRule="auto"/>
+      </w:pPr>
+      <w:r>
+        <w:t>Before migrations, production seed work, or campaign deletion, create both an RDS manual snapshot and a manual logical backup.</w:t>
+      </w:r>
+    </w:p>
+    <w:p>
+      <w:pPr>
+        <w:pStyle w:val="ListBullet"/>
+        <w:spacing w:after="80" w:line="300" w:lineRule="auto"/>
+      </w:pPr>
+      <w:r>
+        <w:t>Copy manual logical backups off the EC2 host.</w:t>
+      </w:r>
+    </w:p>
+    <w:p>
+      <w:pPr>
+        <w:pStyle w:val="ListBullet"/>
+        <w:spacing w:after="80" w:line="300" w:lineRule="auto"/>
+      </w:pPr>
+      <w:r>
+        <w:t>Restore drills should use a temporary database target, never overwrite production.</w:t>
+      </w:r>
+    </w:p>
+    <w:p>
+      <w:pPr>
+        <w:pStyle w:val="ListBullet"/>
+        <w:spacing w:after="80" w:line="300" w:lineRule="auto"/>
+      </w:pPr>
+      <w:r>
+        <w:t>After a restore, verify login, campaign list, People Directory, Sponsor Directory, Gift Search, Reports, and Admin Health.</w:t>
+      </w:r>
+    </w:p>
+    <w:p>
+      <w:pPr>
+        <w:pStyle w:val="ListBullet"/>
+        <w:spacing w:after="80" w:line="300" w:lineRule="auto"/>
+      </w:pPr>
+      <w:r>
+        <w:t>Regenerate Qdrant indexes from Admin Health if Ask or semantic gift search collections are missing or stale.</w:t>
+      </w:r>
+    </w:p>
+    <w:tbl>
+      <w:tblPr>
+        <w:tblW w:type="auto" w:w="0"/>
+        <w:tblLayout w:type="fixed"/>
+        <w:tblLook w:firstColumn="1" w:firstRow="1" w:lastColumn="0" w:lastRow="0" w:noHBand="0" w:noVBand="1" w:val="04A0"/>
+      </w:tblPr>
+      <w:tblGrid>
+        <w:gridCol w:w="9936"/>
+      </w:tblGrid>
+      <w:tr>
+        <w:tc>
+          <w:tcPr>
+            <w:tcW w:type="dxa" w:w="9000"/>
+            <w:shd w:fill="F8F5EF"/>
+          </w:tcPr>
+          <w:p>
+            <w:pPr>
+              <w:spacing w:after="60"/>
+            </w:pPr>
+            <w:r>
+              <w:rPr>
+                <w:b/>
+                <w:color w:val="2A0F3D"/>
+              </w:rPr>
+              <w:t>Campaign delete safety</w:t>
+            </w:r>
+          </w:p>
+          <w:p>
+            <w:pPr>
+              <w:spacing w:after="0"/>
+            </w:pPr>
+            <w:r>
+              <w:t>Campaign deletion is app-admin only. The confirmation modal requires the exact campaign name and campaign year and shows the deletion-impact list before the delete button is enabled.</w:t>
+            </w:r>
+          </w:p>
+        </w:tc>
+      </w:tr>
+    </w:tbl>
     <w:p>
       <w:pPr>
         <w:pStyle w:val="Heading1"/>

</xml_diff>

<commit_message>
Add pool inventory assignment workflow
</commit_message>
<xml_diff>
--- a/docs/user-guide/Blessing Tree User Guide.docx
+++ b/docs/user-guide/Blessing Tree User Guide.docx
@@ -74,7 +74,7 @@
         <w:jc w:val="center"/>
       </w:pPr>
       <w:r>
-        <w:t>Prepared June 5, 2026</w:t>
+        <w:t>Prepared June 8, 2026</w:t>
       </w:r>
     </w:p>
     <w:tbl>
@@ -1502,7 +1502,7 @@
         <w:spacing w:after="120" w:line="300" w:lineRule="auto"/>
       </w:pPr>
       <w:r>
-        <w:t>Use the directory when someone is already in the system. Search for a family, organization, child, or adult, then click the row to open the drawer. The drawer is also where staff can add another child or adult to an existing household, add a family under an organization, edit contacts, and manage wishlist details. Directory tables include sortable recipient IDs, program abbreviation quick filters, gift descriptions, gift sizes/details, and committed sponsor names. Use Expand All or Collapse All on the left and PDF or Excel export buttons in the upper right when staff need a printed operating list.</w:t>
+        <w:t>Use the directory when someone is already in the system. Search for a family, organization, child, or adult, then click the row to open the drawer. The drawer is also where staff can add another child or adult to an existing household, add a family under an organization, edit contacts, and manage wishlist details. Directory tables include sortable family group IDs and recipient IDs, program abbreviation quick filters, gift descriptions, gift sizes/details, and committed sponsor names. Family IDs such as BT-001 identify the whole family; suffixed IDs such as BT-001-01 identify one recipient in that family. Use Expand All or Collapse All on the left and PDF or Excel export buttons in the upper right when staff need a printed operating list.</w:t>
       </w:r>
     </w:p>
     <w:p>
@@ -1899,7 +1899,7 @@
         <w:spacing w:after="120" w:line="300" w:lineRule="auto"/>
       </w:pPr>
       <w:r>
-        <w:t>Gift Search helps staff or eligible sponsors find gifts to reserve or commit to. The search supports natural-language prompts such as 'girls age 8 to 10 who need coats' and can use Qdrant semantic matching for broader terms such as toys, Batman gifts, or video games when the wishlist uses a more specific description. Search chips show inferred filters and can be cleared. Results are paginated and can be exported to PDF or Excel from the upper right of the results container.</w:t>
+        <w:t>Gift Search helps staff or eligible sponsors find gifts to reserve or commit to. The search supports natural-language prompts such as 'girls age 8 to 10 who need coats' and can use Qdrant semantic matching for broader terms such as toys, Batman gifts, or video games when the wishlist uses a more specific description. Search chips show inferred filters and can be cleared. Results are paginated, sorted in natural recipient ID order, and can be exported to PDF or Excel from the upper right of the results container.</w:t>
       </w:r>
     </w:p>
     <w:p>
@@ -2072,7 +2072,265 @@
         <w:spacing w:after="120" w:line="300" w:lineRule="auto"/>
       </w:pPr>
       <w:r>
-        <w:t>The Gift Pool is for donated gifts that are not initially tied to a specific wishlist item, such as a group donation of coats. Staff can inventory those gifts and later match them to people who need them.</w:t>
+        <w:t>The Gift Pool is for donated gifts that are not already promised to a specific person. Use it for toy-drive overflow, bulk coats, gift cards, emergency inventory, senior ministry donations, or other extra items. Staff enter the donated items once, then assign the available quantity to recipient wishlist items later.</w:t>
+      </w:r>
+    </w:p>
+    <w:p>
+      <w:pPr>
+        <w:pStyle w:val="ListBullet"/>
+        <w:spacing w:after="80" w:line="300" w:lineRule="auto"/>
+      </w:pPr>
+      <w:r>
+        <w:t>The top cards separate row counts from physical item counts. Inventory Lines counts table rows. Total Items, Available Items, and Assigned Items count actual physical quantities.</w:t>
+      </w:r>
+    </w:p>
+    <w:p>
+      <w:pPr>
+        <w:pStyle w:val="ListBullet"/>
+        <w:spacing w:after="80" w:line="300" w:lineRule="auto"/>
+      </w:pPr>
+      <w:r>
+        <w:t>Use Add Inventory to enter donated goods, quantity, category, size, age fit, gender fit, condition, source label, and notes.</w:t>
+      </w:r>
+    </w:p>
+    <w:p>
+      <w:pPr>
+        <w:pStyle w:val="ListBullet"/>
+        <w:spacing w:after="80" w:line="300" w:lineRule="auto"/>
+      </w:pPr>
+      <w:r>
+        <w:t>Click an inventory row to open the assignment drawer.</w:t>
+      </w:r>
+    </w:p>
+    <w:p>
+      <w:pPr>
+        <w:pStyle w:val="ListBullet"/>
+        <w:spacing w:after="80" w:line="300" w:lineRule="auto"/>
+      </w:pPr>
+      <w:r>
+        <w:t>Review Available, Category, Size, and Fit before assigning so staff know what item they are matching.</w:t>
+      </w:r>
+    </w:p>
+    <w:p>
+      <w:pPr>
+        <w:pStyle w:val="ListBullet"/>
+        <w:spacing w:after="80" w:line="300" w:lineRule="auto"/>
+      </w:pPr>
+      <w:r>
+        <w:t>Suggested Matches is the normal starting point. It shows fit-ranked recommendations for the selected inventory item.</w:t>
+      </w:r>
+    </w:p>
+    <w:p>
+      <w:pPr>
+        <w:pStyle w:val="ListBullet"/>
+        <w:spacing w:after="80" w:line="300" w:lineRule="auto"/>
+      </w:pPr>
+      <w:r>
+        <w:t>Needs Gifts is for fairness checks. It shows recipients who do not have any gift covered yet, ordered by family and recipient ID.</w:t>
+      </w:r>
+    </w:p>
+    <w:p>
+      <w:pPr>
+        <w:pStyle w:val="ListBullet"/>
+        <w:spacing w:after="80" w:line="300" w:lineRule="auto"/>
+      </w:pPr>
+      <w:r>
+        <w:t>Search is for a specific lookup. It stays empty until staff type a recipient ID, family ID, recipient name, gift description, category, or size.</w:t>
+      </w:r>
+    </w:p>
+    <w:p>
+      <w:pPr>
+        <w:pStyle w:val="ListBullet"/>
+        <w:spacing w:after="80" w:line="300" w:lineRule="auto"/>
+      </w:pPr>
+      <w:r>
+        <w:t>Set the quantity to assign, add optional assignment notes, and choose Assign. The assignment reduces available inventory and updates the recipient wishlist item.</w:t>
+      </w:r>
+    </w:p>
+    <w:p>
+      <w:pPr>
+        <w:pStyle w:val="ListBullet"/>
+        <w:spacing w:after="80" w:line="300" w:lineRule="auto"/>
+      </w:pPr>
+      <w:r>
+        <w:t>If staff assign inventory to the wrong recipient, use Remove in the Assignments section. Removing asks for confirmation, returns the quantity to available inventory, and reopens the recipient gift if nothing else covers it.</w:t>
+      </w:r>
+    </w:p>
+    <w:p>
+      <w:pPr>
+        <w:pStyle w:val="Heading3"/>
+      </w:pPr>
+      <w:r>
+        <w:rPr>
+          <w:rFonts w:ascii="Calibri" w:hAnsi="Calibri"/>
+          <w:color w:val="1F4D78"/>
+        </w:rPr>
+        <w:t>Assign Donated Inventory</w:t>
+      </w:r>
+    </w:p>
+    <w:p>
+      <w:pPr>
+        <w:pStyle w:val="ListNumber"/>
+        <w:spacing w:after="80" w:line="300" w:lineRule="auto"/>
+      </w:pPr>
+      <w:r>
+        <w:t>Open Gifts, then Gift Pool.</w:t>
+      </w:r>
+    </w:p>
+    <w:p>
+      <w:pPr>
+        <w:pStyle w:val="ListNumber"/>
+        <w:spacing w:after="80" w:line="300" w:lineRule="auto"/>
+      </w:pPr>
+      <w:r>
+        <w:t>Find or filter the donated inventory row.</w:t>
+      </w:r>
+    </w:p>
+    <w:p>
+      <w:pPr>
+        <w:pStyle w:val="ListNumber"/>
+        <w:spacing w:after="80" w:line="300" w:lineRule="auto"/>
+      </w:pPr>
+      <w:r>
+        <w:t>Click the row to open assignment details.</w:t>
+      </w:r>
+    </w:p>
+    <w:p>
+      <w:pPr>
+        <w:pStyle w:val="ListNumber"/>
+        <w:spacing w:after="80" w:line="300" w:lineRule="auto"/>
+      </w:pPr>
+      <w:r>
+        <w:t>Use Suggested Matches first if staff want the system's best recommendations.</w:t>
+      </w:r>
+    </w:p>
+    <w:p>
+      <w:pPr>
+        <w:pStyle w:val="ListNumber"/>
+        <w:spacing w:after="80" w:line="300" w:lineRule="auto"/>
+      </w:pPr>
+      <w:r>
+        <w:t>Use Needs Gifts if staff want to prioritize recipients with no gift covered.</w:t>
+      </w:r>
+    </w:p>
+    <w:p>
+      <w:pPr>
+        <w:pStyle w:val="ListNumber"/>
+        <w:spacing w:after="80" w:line="300" w:lineRule="auto"/>
+      </w:pPr>
+      <w:r>
+        <w:t>Use Search if staff already know the recipient ID, family ID, name, gift, category, or size.</w:t>
+      </w:r>
+    </w:p>
+    <w:p>
+      <w:pPr>
+        <w:pStyle w:val="ListNumber"/>
+        <w:spacing w:after="80" w:line="300" w:lineRule="auto"/>
+      </w:pPr>
+      <w:r>
+        <w:t>Review the recipient, family ID, gift description, size, category, and needed quantity.</w:t>
+      </w:r>
+    </w:p>
+    <w:p>
+      <w:pPr>
+        <w:pStyle w:val="ListNumber"/>
+        <w:spacing w:after="80" w:line="300" w:lineRule="auto"/>
+      </w:pPr>
+      <w:r>
+        <w:t>Enter the quantity to assign. Do not assign more than the recipient needs or more than inventory has available.</w:t>
+      </w:r>
+    </w:p>
+    <w:p>
+      <w:pPr>
+        <w:pStyle w:val="ListNumber"/>
+        <w:spacing w:after="80" w:line="300" w:lineRule="auto"/>
+      </w:pPr>
+      <w:r>
+        <w:t>Add notes when the donated item is a substitute or staff need to explain why the item was assigned.</w:t>
+      </w:r>
+    </w:p>
+    <w:p>
+      <w:pPr>
+        <w:pStyle w:val="ListNumber"/>
+        <w:spacing w:after="80" w:line="300" w:lineRule="auto"/>
+      </w:pPr>
+      <w:r>
+        <w:t>Choose Assign.</w:t>
+      </w:r>
+    </w:p>
+    <w:p>
+      <w:pPr>
+        <w:pStyle w:val="Heading3"/>
+      </w:pPr>
+      <w:r>
+        <w:rPr>
+          <w:rFonts w:ascii="Calibri" w:hAnsi="Calibri"/>
+          <w:color w:val="1F4D78"/>
+        </w:rPr>
+        <w:t>Remove a Pool Assignment</w:t>
+      </w:r>
+    </w:p>
+    <w:p>
+      <w:pPr>
+        <w:pStyle w:val="ListNumber"/>
+        <w:spacing w:after="80" w:line="300" w:lineRule="auto"/>
+      </w:pPr>
+      <w:r>
+        <w:t>Open Gifts, then Gift Pool.</w:t>
+      </w:r>
+    </w:p>
+    <w:p>
+      <w:pPr>
+        <w:pStyle w:val="ListNumber"/>
+        <w:spacing w:after="80" w:line="300" w:lineRule="auto"/>
+      </w:pPr>
+      <w:r>
+        <w:t>Find the inventory row that was assigned incorrectly.</w:t>
+      </w:r>
+    </w:p>
+    <w:p>
+      <w:pPr>
+        <w:pStyle w:val="ListNumber"/>
+        <w:spacing w:after="80" w:line="300" w:lineRule="auto"/>
+      </w:pPr>
+      <w:r>
+        <w:t>Click the row to open assignment details.</w:t>
+      </w:r>
+    </w:p>
+    <w:p>
+      <w:pPr>
+        <w:pStyle w:val="ListNumber"/>
+        <w:spacing w:after="80" w:line="300" w:lineRule="auto"/>
+      </w:pPr>
+      <w:r>
+        <w:t>In Assignments, find the recipient or wishlist item that should no longer receive that inventory.</w:t>
+      </w:r>
+    </w:p>
+    <w:p>
+      <w:pPr>
+        <w:pStyle w:val="ListNumber"/>
+        <w:spacing w:after="80" w:line="300" w:lineRule="auto"/>
+      </w:pPr>
+      <w:r>
+        <w:t>Choose Remove.</w:t>
+      </w:r>
+    </w:p>
+    <w:p>
+      <w:pPr>
+        <w:pStyle w:val="ListNumber"/>
+        <w:spacing w:after="80" w:line="300" w:lineRule="auto"/>
+      </w:pPr>
+      <w:r>
+        <w:t>Read the confirmation carefully and confirm the removal.</w:t>
+      </w:r>
+    </w:p>
+    <w:p>
+      <w:pPr>
+        <w:pStyle w:val="ListNumber"/>
+        <w:spacing w:after="80" w:line="300" w:lineRule="auto"/>
+      </w:pPr>
+      <w:r>
+        <w:t>The available inventory quantity increases again. The recipient gift returns to open if it is no longer covered by pool inventory.</w:t>
       </w:r>
     </w:p>
     <w:p>
@@ -2145,7 +2403,7 @@
         <w:spacing w:after="120" w:line="300" w:lineRule="auto"/>
       </w:pPr>
       <w:r>
-        <w:t>Gift Status is the visual report for the gift workflow. It lists recipients, their wishlist gifts, and each status in the workflow so staff can see what is sponsored, received, wrapped, ready, picked up, and distributed at a glance. The page polls while visible so scan updates appear without a manual refresh.</w:t>
+        <w:t>Gift Status is the visual report for the gift workflow. It lists recipients, their wishlist gifts, and each status in the workflow so staff can see what is sponsored, received, wrapped, ready, picked up, and distributed at a glance. The page polls while visible so scan updates appear without a manual refresh. On mobile receive, staff can enter a family ID such as BT-001 to show all recipients and wishlist items in that family, or a suffixed recipient ID such as BT-001-01 to show only that recipient.</w:t>
       </w:r>
     </w:p>
     <w:p>

</xml_diff>